<commit_message>
Publish evidence-led story and review guidance
</commit_message>
<xml_diff>
--- a/docs/linkedin-post.docx
+++ b/docs/linkedin-post.docx
@@ -4,263 +4,429 @@
   <w:body>
     <w:p>
       <w:pPr>
-        <w:keepNext/>
-        <w:keepLines/>
+        <w:pStyle w:val="Title"/>
+        <w:jc w:val="left"/>
       </w:pPr>
       <w:r>
         <w:rPr>
           <w:b/>
         </w:rPr>
-        <w:t>“You need experience to get a job.”</w:t>
+        <w:t>LinkedIn Data Story</w:t>
+      </w:r>
+    </w:p>
+    <w:p>
+      <w:r>
+        <w:rPr>
+          <w:color w:val="5A6673"/>
+          <w:sz w:val="26"/>
+        </w:rPr>
+        <w:t>Youth unemployment recovery stalled across most subregions</w:t>
+      </w:r>
+    </w:p>
+    <w:tbl>
+      <w:tblPr>
+        <w:tblW w:type="auto" w:w="0"/>
+        <w:tblLayout w:type="fixed"/>
+        <w:tblLook w:firstColumn="1" w:firstRow="1" w:lastColumn="0" w:lastRow="0" w:noHBand="0" w:noVBand="1" w:val="04A0"/>
+      </w:tblPr>
+      <w:tblGrid>
+        <w:gridCol w:w="3096"/>
+        <w:gridCol w:w="3096"/>
+        <w:gridCol w:w="3096"/>
+      </w:tblGrid>
+      <w:tr>
+        <w:tc>
+          <w:tcPr>
+            <w:tcW w:type="dxa" w:w="3312"/>
+            <w:shd w:fill="EAF4F8"/>
+          </w:tcPr>
+          <w:p>
+            <w:pPr>
+              <w:jc w:val="center"/>
+            </w:pPr>
+            <w:r>
+              <w:rPr>
+                <w:b/>
+                <w:color w:val="173F5F"/>
+                <w:sz w:val="38"/>
+              </w:rPr>
+              <w:t>12.4%</w:t>
+            </w:r>
+            <w:r>
+              <w:rPr>
+                <w:sz w:val="17"/>
+              </w:rPr>
+              <w:br/>
+              <w:t>global youth unemployment rate, 2025</w:t>
+            </w:r>
+          </w:p>
+        </w:tc>
+        <w:tc>
+          <w:tcPr>
+            <w:tcW w:type="dxa" w:w="3312"/>
+            <w:shd w:fill="EAF4F8"/>
+          </w:tcPr>
+          <w:p>
+            <w:pPr>
+              <w:jc w:val="center"/>
+            </w:pPr>
+            <w:r>
+              <w:rPr>
+                <w:b/>
+                <w:color w:val="173F5F"/>
+                <w:sz w:val="38"/>
+              </w:rPr>
+              <w:t>≈67M</w:t>
+            </w:r>
+            <w:r>
+              <w:rPr>
+                <w:sz w:val="17"/>
+              </w:rPr>
+              <w:br/>
+              <w:t>unemployed youth worldwide</w:t>
+            </w:r>
+          </w:p>
+        </w:tc>
+        <w:tc>
+          <w:tcPr>
+            <w:tcW w:type="dxa" w:w="3312"/>
+            <w:shd w:fill="EAF4F8"/>
+          </w:tcPr>
+          <w:p>
+            <w:pPr>
+              <w:jc w:val="center"/>
+            </w:pPr>
+            <w:r>
+              <w:rPr>
+                <w:b/>
+                <w:color w:val="173F5F"/>
+                <w:sz w:val="38"/>
+              </w:rPr>
+              <w:t>8 of 11</w:t>
+            </w:r>
+            <w:r>
+              <w:rPr>
+                <w:sz w:val="17"/>
+              </w:rPr>
+              <w:br/>
+              <w:t>subregions worsened or did not improve</w:t>
+            </w:r>
+          </w:p>
+        </w:tc>
+      </w:tr>
+    </w:tbl>
+    <w:p>
+      <w:pPr>
+        <w:pStyle w:val="Heading1"/>
+      </w:pPr>
+      <w:r>
+        <w:t>Recommended post</w:t>
+      </w:r>
+    </w:p>
+    <w:p>
+      <w:r>
+        <w:t>Youth unemployment is back near its pre-pandemic global rate. The recovery, however, has stalled across most subregions.</w:t>
+      </w:r>
+    </w:p>
+    <w:p>
+      <w:r>
+        <w:t>The ILO estimates the global youth unemployment rate at 12.4% in 2025, compared with 12.3% in 2023. That small global movement hides a much more uneven regional picture:</w:t>
       </w:r>
     </w:p>
     <w:p>
       <w:pPr>
-        <w:keepLines/>
+        <w:pStyle w:val="ListBullet"/>
       </w:pPr>
       <w:r>
-        <w:rPr>
-          <w:b/>
-        </w:rPr>
-        <w:t>But how do you gain experience if no one will hire you?</w:t>
+        <w:t>6 of 11 subregions recorded an increase</w:t>
       </w:r>
     </w:p>
     <w:p>
       <w:pPr>
-        <w:keepLines/>
+        <w:pStyle w:val="ListBullet"/>
       </w:pPr>
       <w:r>
-        <w:t>As a Data Analyst, I look at the numbers. As a Christian, I think about the people whose pain those averages cannot capture.</w:t>
+        <w:t>2 showed no change</w:t>
       </w:r>
     </w:p>
     <w:p>
       <w:pPr>
-        <w:keepLines/>
+        <w:pStyle w:val="ListBullet"/>
       </w:pPr>
       <w:r>
-        <w:t>The ILO’s August 2026 report estimates that 67 million young people were unemployed worldwide in 2025.</w:t>
+        <w:t>3 recorded a decrease</w:t>
+      </w:r>
+    </w:p>
+    <w:p>
+      <w:r>
+        <w:t>Northern Africa (+1.8 percentage points) and Northern America (+1.6 pp) saw the largest increases. Eastern Europe (−1.6 pp) and Latin America and the Caribbean (−1.4 pp) moved in the opposite direction.</w:t>
+      </w:r>
+    </w:p>
+    <w:p>
+      <w:r>
+        <w:t>The practical lesson: a stable global average does not mean a broad-based recovery. Regional direction and the quality of available work matter alongside the headline rate. A low unemployment rate can still coexist with inactivity, informality or insecure work.</w:t>
+      </w:r>
+    </w:p>
+    <w:p>
+      <w:r>
+        <w:t>I rebuilt the analysis as a reviewable Excel evidence layer and a Power BI report with desktop and phone layouts. The source is the ILO’s Global Employment Trends for Youth 2026.</w:t>
+      </w:r>
+    </w:p>
+    <w:p>
+      <w:r>
+        <w:t>Which labour-market measure would you pair with unemployment to judge whether young people are genuinely gaining ground?</w:t>
+      </w:r>
+    </w:p>
+    <w:p>
+      <w:r>
+        <w:t>#DataAnalytics #PowerBI #YouthEmployment #LabourMarket #DataStorytelling</w:t>
       </w:r>
     </w:p>
     <w:p>
       <w:pPr>
-        <w:keepNext/>
-        <w:keepLines/>
+        <w:pStyle w:val="Heading1"/>
       </w:pPr>
       <w:r>
-        <w:t>Youth unemployment stood at:</w:t>
+        <w:t>Alternative opening hooks</w:t>
       </w:r>
     </w:p>
     <w:p>
       <w:pPr>
-        <w:keepNext/>
-        <w:keepLines/>
-        <w:spacing w:after="40"/>
-        <w:ind w:left="216"/>
+        <w:pStyle w:val="ListNumber"/>
       </w:pPr>
       <w:r>
-        <w:t>• 12.4% globally.</w:t>
+        <w:t>The global youth unemployment rate barely moved. The regional map did.</w:t>
       </w:r>
     </w:p>
     <w:p>
       <w:pPr>
-        <w:keepNext/>
-        <w:keepLines/>
-        <w:spacing w:after="40"/>
-        <w:ind w:left="216"/>
+        <w:pStyle w:val="ListNumber"/>
       </w:pPr>
       <w:r>
-        <w:t>• 9.8% in Northern America.</w:t>
+        <w:t>A stable average can conceal a stalled recovery: 8 of 11 subregions worsened or failed to improve between 2023 and 2025.</w:t>
       </w:r>
     </w:p>
     <w:p>
       <w:pPr>
-        <w:keepLines/>
-        <w:spacing w:after="40"/>
-        <w:ind w:left="216"/>
+        <w:pStyle w:val="ListNumber"/>
       </w:pPr>
       <w:r>
-        <w:t>• 15.0% in Northern, Southern and Western Europe.</w:t>
+        <w:t>About 67 million young people were unemployed in 2025—and the direction of travel differed sharply by region.</w:t>
       </w:r>
     </w:p>
     <w:p>
       <w:pPr>
-        <w:keepLines/>
+        <w:pStyle w:val="Heading1"/>
       </w:pPr>
       <w:r>
-        <w:t>Between 2023 and 2025, youth unemployment increased in eight of the world’s eleven subregions. Behind these numbers are people waiting for someone to give them their first opportunity.</w:t>
+        <w:t>Evidence and wording guardrails</w:t>
+      </w:r>
+    </w:p>
+    <w:tbl>
+      <w:tblPr>
+        <w:tblStyle w:val="TableGrid"/>
+        <w:tblW w:type="auto" w:w="0"/>
+        <w:tblLook w:firstColumn="1" w:firstRow="1" w:lastColumn="0" w:lastRow="0" w:noHBand="0" w:noVBand="1" w:val="04A0"/>
+      </w:tblPr>
+      <w:tblGrid>
+        <w:gridCol w:w="2448"/>
+        <w:gridCol w:w="6912"/>
+      </w:tblGrid>
+      <w:tr>
+        <w:trPr>
+          <w:tblHeader w:val="true"/>
+        </w:trPr>
+        <w:tc>
+          <w:tcPr>
+            <w:tcW w:type="dxa" w:w="4968"/>
+            <w:shd w:fill="173F5F"/>
+          </w:tcPr>
+          <w:p>
+            <w:r>
+              <w:rPr>
+                <w:b/>
+                <w:color w:val="FFFFFF"/>
+              </w:rPr>
+              <w:t>Item</w:t>
+            </w:r>
+          </w:p>
+        </w:tc>
+        <w:tc>
+          <w:tcPr>
+            <w:tcW w:type="dxa" w:w="4968"/>
+            <w:shd w:fill="173F5F"/>
+          </w:tcPr>
+          <w:p>
+            <w:r>
+              <w:rPr>
+                <w:b/>
+                <w:color w:val="FFFFFF"/>
+              </w:rPr>
+              <w:t>Approved wording</w:t>
+            </w:r>
+          </w:p>
+        </w:tc>
+      </w:tr>
+      <w:tr>
+        <w:tc>
+          <w:tcPr>
+            <w:tcW w:type="dxa" w:w="2448"/>
+          </w:tcPr>
+          <w:p>
+            <w:r>
+              <w:t>Metric</w:t>
+            </w:r>
+          </w:p>
+        </w:tc>
+        <w:tc>
+          <w:tcPr>
+            <w:tcW w:type="dxa" w:w="6912"/>
+          </w:tcPr>
+          <w:p>
+            <w:r>
+              <w:t>Unemployed youth as a share of the youth labour force; ages 15–24.</w:t>
+            </w:r>
+          </w:p>
+        </w:tc>
+      </w:tr>
+      <w:tr>
+        <w:tc>
+          <w:tcPr>
+            <w:tcW w:type="dxa" w:w="2448"/>
+          </w:tcPr>
+          <w:p>
+            <w:r>
+              <w:t>Comparison</w:t>
+            </w:r>
+          </w:p>
+        </w:tc>
+        <w:tc>
+          <w:tcPr>
+            <w:tcW w:type="dxa" w:w="6912"/>
+          </w:tcPr>
+          <w:p>
+            <w:r>
+              <w:t>Use the ILO-reported percentage-point changes from Figure 1.3; do not recompute them from rounded annual rates.</w:t>
+            </w:r>
+          </w:p>
+        </w:tc>
+      </w:tr>
+      <w:tr>
+        <w:tc>
+          <w:tcPr>
+            <w:tcW w:type="dxa" w:w="2448"/>
+          </w:tcPr>
+          <w:p>
+            <w:r>
+              <w:t>Core claim</w:t>
+            </w:r>
+          </w:p>
+        </w:tc>
+        <w:tc>
+          <w:tcPr>
+            <w:tcW w:type="dxa" w:w="6912"/>
+          </w:tcPr>
+          <w:p>
+            <w:r>
+              <w:t>Youth unemployment worsened or failed to improve in 8 of 11 subregions between 2023 and 2025.</w:t>
+            </w:r>
+          </w:p>
+        </w:tc>
+      </w:tr>
+      <w:tr>
+        <w:tc>
+          <w:tcPr>
+            <w:tcW w:type="dxa" w:w="2448"/>
+          </w:tcPr>
+          <w:p>
+            <w:r>
+              <w:t>Causality</w:t>
+            </w:r>
+          </w:p>
+        </w:tc>
+        <w:tc>
+          <w:tcPr>
+            <w:tcW w:type="dxa" w:w="6912"/>
+          </w:tcPr>
+          <w:p>
+            <w:r>
+              <w:t>Do not attribute the changes to AI or any single factor; the source does not provide a causal design.</w:t>
+            </w:r>
+          </w:p>
+        </w:tc>
+      </w:tr>
+      <w:tr>
+        <w:tc>
+          <w:tcPr>
+            <w:tcW w:type="dxa" w:w="2448"/>
+          </w:tcPr>
+          <w:p>
+            <w:r>
+              <w:t>Scope</w:t>
+            </w:r>
+          </w:p>
+        </w:tc>
+        <w:tc>
+          <w:tcPr>
+            <w:tcW w:type="dxa" w:w="6912"/>
+          </w:tcPr>
+          <w:p>
+            <w:r>
+              <w:t>Use 2016–2025 estimates only. The public analysis excludes 2026–2027 projections.</w:t>
+            </w:r>
+          </w:p>
+        </w:tc>
+      </w:tr>
+    </w:tbl>
+    <w:p>
+      <w:pPr>
+        <w:pStyle w:val="Heading2"/>
+      </w:pPr>
+      <w:r>
+        <w:t>Source</w:t>
       </w:r>
     </w:p>
     <w:p>
-      <w:pPr>
-        <w:keepLines/>
-      </w:pPr>
-      <w:r>
-        <w:t xml:space="preserve">Source: </w:t>
-      </w:r>
-      <w:hyperlink r:id="rId9">
-        <w:r>
-          <w:rPr>
-            <w:color w:val="0563C1"/>
-            <w:u w:val="single"/>
-          </w:rPr>
-          <w:t>ILO, Global Employment Trends for Youth 2026</w:t>
-        </w:r>
-      </w:hyperlink>
-      <w:r>
-        <w:t>.</w:t>
-      </w:r>
-    </w:p>
-    <w:p>
-      <w:pPr>
-        <w:keepLines/>
-      </w:pPr>
-      <w:r>
-        <w:t>After another rejection, “Where will I work?” becomes a deeper question: “Do I have any worth at all?”</w:t>
-      </w:r>
-    </w:p>
-    <w:p>
-      <w:pPr>
-        <w:keepLines/>
-      </w:pPr>
-      <w:r>
-        <w:t>And sometimes, a more painful one: “Lord, do You see me?”</w:t>
-      </w:r>
-    </w:p>
-    <w:p>
-      <w:pPr>
-        <w:keepNext/>
-        <w:keepLines/>
-      </w:pPr>
-      <w:r>
-        <w:t>Jesus says:</w:t>
-      </w:r>
-    </w:p>
-    <w:p>
-      <w:pPr>
-        <w:keepNext/>
-        <w:keepLines/>
-        <w:ind w:left="288"/>
-      </w:pPr>
       <w:r>
         <w:rPr>
           <w:i/>
         </w:rPr>
-        <w:t>“Seek the Kingdom of God above all else, and live righteously, and he will give you everything you need.”</w:t>
+        <w:t xml:space="preserve">International Labour Organization, </w:t>
       </w:r>
-    </w:p>
-    <w:p>
-      <w:pPr>
-        <w:keepLines/>
-        <w:ind w:left="288"/>
-      </w:pPr>
       <w:r>
-        <w:rPr>
-          <w:i/>
-        </w:rPr>
-        <w:t>— Matthew 6:33, NLT</w:t>
+        <w:t>Global Employment Trends for Youth 2026: Back to the future</w:t>
       </w:r>
-    </w:p>
-    <w:p>
-      <w:pPr>
-        <w:keepLines/>
-      </w:pPr>
       <w:r>
-        <w:t>It is easy to turn these words into a transaction: if I have enough faith, God will give me a job. Then every rejection begins to feel like evidence that my faith is inadequate.</w:t>
-      </w:r>
-    </w:p>
-    <w:p>
-      <w:pPr>
-        <w:keepLines/>
-      </w:pPr>
-      <w:r>
-        <w:t>But Jesus speaks of the Father’s care in the context of our most basic needs: food, drink, and clothing. He knows the bills are real. His promise does not specify a hiring date or a salary.</w:t>
-      </w:r>
-    </w:p>
-    <w:p>
-      <w:pPr>
-        <w:keepLines/>
-      </w:pPr>
-      <w:r>
-        <w:t>The gospel gives us a foundation for our dignity before our next interview. In Christ, God’s love for us precedes our achievements. An employer assesses our fit for a vacancy; that decision cannot measure our worth as a person.</w:t>
-      </w:r>
-    </w:p>
-    <w:p>
-      <w:pPr>
-        <w:keepNext/>
-        <w:keepLines/>
-        <w:pageBreakBefore/>
-      </w:pPr>
-      <w:r>
-        <w:rPr>
-          <w:b/>
-        </w:rPr>
-        <w:t>Why does God allow such a trial?</w:t>
-      </w:r>
-    </w:p>
-    <w:p>
-      <w:pPr>
-        <w:keepLines/>
-      </w:pPr>
-      <w:r>
-        <w:t>I do not know the reason behind every rejection. And I do not want to explain someone else’s suffering too quickly. But even in the waiting, God can teach us to accept help, notice the needs of others, and release our hearts from the constant pressure to prove our significance.</w:t>
-      </w:r>
-    </w:p>
-    <w:p>
-      <w:pPr>
-        <w:keepLines/>
-      </w:pPr>
-      <w:r>
-        <w:t>This does not mean He wants us to live in poverty or sickness. Need calls for help, and people in need deserve compassion. Christ Himself entered into human suffering. We can therefore bring Him our fear, exhaustion, and questions.</w:t>
-      </w:r>
-    </w:p>
-    <w:p>
-      <w:pPr>
-        <w:keepLines/>
-      </w:pPr>
-      <w:r>
-        <w:t>Trusting the Lord during a job search can be deeply practical: praying and sending applications. Learning and resting. Seeking feedback and support from a church community. Being honest about our skills, even when we feel tempted to exaggerate our experience.</w:t>
-      </w:r>
-    </w:p>
-    <w:p>
-      <w:pPr>
-        <w:keepLines/>
-      </w:pPr>
-      <w:r>
-        <w:t>And if we already have a job, whose prayer might we help answer today? We can review a portfolio, introduce someone to an employer, or offer a paid internship to a person without experience.</w:t>
-      </w:r>
-    </w:p>
-    <w:p>
-      <w:pPr>
-        <w:keepLines/>
-      </w:pPr>
-      <w:r>
-        <w:t>Faith allows us to say: “I do not know when this waiting will end. But I can take the next step because I am already loved.”</w:t>
-      </w:r>
-    </w:p>
-    <w:p>
-      <w:pPr>
-        <w:keepLines/>
-      </w:pPr>
-      <w:r>
-        <w:t>What helps you keep trusting God when your job search takes longer than you hoped?</w:t>
-      </w:r>
-    </w:p>
-    <w:p>
-      <w:pPr>
-        <w:keepLines/>
-      </w:pPr>
-      <w:r>
-        <w:t>#FaithAndWork #JobSearch #DataAnalytics</w:t>
+        <w:t xml:space="preserve"> — Table A.1 and Figure 1.3 (corrected accessible PDF dated 31 August 2026).</w:t>
       </w:r>
     </w:p>
     <w:sectPr>
-      <w:pgSz w:w="11909" w:h="16834"/>
-      <w:pgMar w:top="1080" w:right="1224" w:bottom="1080" w:left="1224" w:header="720" w:footer="720" w:gutter="0"/>
+      <w:footerReference w:type="default" r:id="rId9"/>
+      <w:pgSz w:w="12240" w:h="15840"/>
+      <w:pgMar w:top="936" w:right="1152" w:bottom="936" w:left="1152" w:header="720" w:footer="720" w:gutter="0"/>
       <w:cols w:space="720"/>
       <w:docGrid w:linePitch="360"/>
     </w:sectPr>
   </w:body>
 </w:document>
+</file>
+
+<file path=word/footer1.xml><?xml version="1.0" encoding="utf-8"?>
+<w:ftr xmlns:m="http://schemas.openxmlformats.org/officeDocument/2006/math" xmlns:mc="http://schemas.openxmlformats.org/markup-compatibility/2006" xmlns:mo="http://schemas.microsoft.com/office/mac/office/2008/main" xmlns:mv="urn:schemas-microsoft-com:mac:vml" xmlns:o="urn:schemas-microsoft-com:office:office" xmlns:r="http://schemas.openxmlformats.org/officeDocument/2006/relationships" xmlns:v="urn:schemas-microsoft-com:vml" xmlns:w10="urn:schemas-microsoft-com:office:word" xmlns:w14="http://schemas.microsoft.com/office/word/2010/wordml" xmlns:w="http://schemas.openxmlformats.org/wordprocessingml/2006/main" xmlns:wne="http://schemas.microsoft.com/office/word/2006/wordml" xmlns:wp14="http://schemas.microsoft.com/office/word/2010/wordprocessingDrawing" xmlns:wp="http://schemas.openxmlformats.org/drawingml/2006/wordprocessingDrawing" xmlns:wpc="http://schemas.microsoft.com/office/word/2010/wordprocessingCanvas" xmlns:wpg="http://schemas.microsoft.com/office/word/2010/wordprocessingGroup" xmlns:wpi="http://schemas.microsoft.com/office/word/2010/wordprocessingInk" xmlns:wps="http://schemas.microsoft.com/office/word/2010/wordprocessingShape" mc:Ignorable="w14 wp14">
+  <w:p>
+    <w:pPr>
+      <w:pStyle w:val="Footer"/>
+      <w:jc w:val="center"/>
+    </w:pPr>
+    <w:r>
+      <w:rPr>
+        <w:color w:val="5A6673"/>
+        <w:sz w:val="16"/>
+      </w:rPr>
+      <w:t>Prepared for LinkedIn · Evidence checked against the ILO source</w:t>
+    </w:r>
+  </w:p>
+</w:ftr>
 </file>
 
 <file path=word/numbering.xml><?xml version="1.0" encoding="utf-8"?>
@@ -627,13 +793,12 @@
     <w:qFormat/>
     <w:rsid w:val="00FC693F"/>
     <w:pPr>
-      <w:widowControl/>
-      <w:spacing w:after="160" w:line="276" w:lineRule="auto"/>
+      <w:spacing w:after="140"/>
     </w:pPr>
     <w:rPr>
       <w:rFonts w:ascii="Arial" w:hAnsi="Arial"/>
-      <w:color w:val="000000"/>
-      <w:sz w:val="24"/>
+      <w:color w:val="1F2937"/>
+      <w:sz w:val="21"/>
     </w:rPr>
   </w:style>
   <w:style w:type="paragraph" w:styleId="Header">
@@ -695,11 +860,11 @@
       <w:outlineLvl w:val="0"/>
     </w:pPr>
     <w:rPr>
-      <w:rFonts w:asciiTheme="majorHAnsi" w:eastAsiaTheme="majorEastAsia" w:hAnsiTheme="majorHAnsi" w:cstheme="majorBidi"/>
+      <w:rFonts w:asciiTheme="majorHAnsi" w:eastAsiaTheme="majorEastAsia" w:hAnsiTheme="majorHAnsi" w:cstheme="majorBidi" w:ascii="Arial" w:hAnsi="Arial"/>
       <w:b/>
       <w:bCs/>
-      <w:color w:val="365F91" w:themeColor="accent1" w:themeShade="BF"/>
-      <w:sz w:val="28"/>
+      <w:color w:val="173F5F"/>
+      <w:sz w:val="32"/>
       <w:szCs w:val="28"/>
     </w:rPr>
   </w:style>
@@ -719,11 +884,11 @@
       <w:outlineLvl w:val="1"/>
     </w:pPr>
     <w:rPr>
-      <w:rFonts w:asciiTheme="majorHAnsi" w:eastAsiaTheme="majorEastAsia" w:hAnsiTheme="majorHAnsi" w:cstheme="majorBidi"/>
+      <w:rFonts w:asciiTheme="majorHAnsi" w:eastAsiaTheme="majorEastAsia" w:hAnsiTheme="majorHAnsi" w:cstheme="majorBidi" w:ascii="Arial" w:hAnsi="Arial"/>
       <w:b/>
       <w:bCs/>
-      <w:color w:val="4F81BD" w:themeColor="accent1"/>
-      <w:sz w:val="26"/>
+      <w:color w:val="2E86AB"/>
+      <w:sz w:val="24"/>
       <w:szCs w:val="26"/>
     </w:rPr>
   </w:style>
@@ -984,11 +1149,11 @@
       <w:contextualSpacing/>
     </w:pPr>
     <w:rPr>
-      <w:rFonts w:asciiTheme="majorHAnsi" w:eastAsiaTheme="majorEastAsia" w:hAnsiTheme="majorHAnsi" w:cstheme="majorBidi"/>
-      <w:color w:val="17365D" w:themeColor="text2" w:themeShade="BF"/>
+      <w:rFonts w:asciiTheme="majorHAnsi" w:eastAsiaTheme="majorEastAsia" w:hAnsiTheme="majorHAnsi" w:cstheme="majorBidi" w:ascii="Arial" w:hAnsi="Arial"/>
+      <w:color w:val="173F5F"/>
       <w:spacing w:val="5"/>
       <w:kern w:val="28"/>
-      <w:sz w:val="52"/>
+      <w:sz w:val="50"/>
       <w:szCs w:val="52"/>
     </w:rPr>
   </w:style>

</xml_diff>

<commit_message>
Tighten review gates and responsive report layout
</commit_message>
<xml_diff>
--- a/docs/linkedin-post.docx
+++ b/docs/linkedin-post.docx
@@ -179,7 +179,7 @@
     </w:p>
     <w:p>
       <w:r>
-        <w:t>#DataAnalytics #PowerBI #YouthEmployment #LabourMarket #DataStorytelling</w:t>
+        <w:t>#DataAnalytics #PowerBI #YouthEmployment</w:t>
       </w:r>
     </w:p>
     <w:p>
@@ -214,6 +214,148 @@
         <w:t>About 67 million young people were unemployed in 2025—and the direction of travel differed sharply by region.</w:t>
       </w:r>
     </w:p>
+    <w:p>
+      <w:pPr>
+        <w:pStyle w:val="Heading1"/>
+      </w:pPr>
+      <w:r>
+        <w:t>Story Lock</w:t>
+      </w:r>
+    </w:p>
+    <w:tbl>
+      <w:tblPr>
+        <w:tblStyle w:val="TableGrid"/>
+        <w:tblW w:type="auto" w:w="0"/>
+        <w:tblLook w:firstColumn="1" w:firstRow="1" w:lastColumn="0" w:lastRow="0" w:noHBand="0" w:noVBand="1" w:val="04A0"/>
+      </w:tblPr>
+      <w:tblGrid>
+        <w:gridCol w:w="2448"/>
+        <w:gridCol w:w="6912"/>
+      </w:tblGrid>
+      <w:tr>
+        <w:trPr>
+          <w:tblHeader w:val="true"/>
+        </w:trPr>
+        <w:tc>
+          <w:tcPr>
+            <w:tcW w:type="dxa" w:w="4968"/>
+            <w:shd w:fill="173F5F"/>
+          </w:tcPr>
+          <w:p>
+            <w:r>
+              <w:rPr>
+                <w:b/>
+                <w:color w:val="FFFFFF"/>
+              </w:rPr>
+              <w:t>Element</w:t>
+            </w:r>
+          </w:p>
+        </w:tc>
+        <w:tc>
+          <w:tcPr>
+            <w:tcW w:type="dxa" w:w="4968"/>
+            <w:shd w:fill="173F5F"/>
+          </w:tcPr>
+          <w:p>
+            <w:r>
+              <w:rPr>
+                <w:b/>
+                <w:color w:val="FFFFFF"/>
+              </w:rPr>
+              <w:t>Locked statement</w:t>
+            </w:r>
+          </w:p>
+        </w:tc>
+      </w:tr>
+      <w:tr>
+        <w:tc>
+          <w:tcPr>
+            <w:tcW w:type="dxa" w:w="2448"/>
+          </w:tcPr>
+          <w:p>
+            <w:r>
+              <w:t>Governing question</w:t>
+            </w:r>
+          </w:p>
+        </w:tc>
+        <w:tc>
+          <w:tcPr>
+            <w:tcW w:type="dxa" w:w="6912"/>
+          </w:tcPr>
+          <w:p>
+            <w:r>
+              <w:t>What changed in the youth labour-market recovery after 2023?</w:t>
+            </w:r>
+          </w:p>
+        </w:tc>
+      </w:tr>
+      <w:tr>
+        <w:tc>
+          <w:tcPr>
+            <w:tcW w:type="dxa" w:w="2448"/>
+          </w:tcPr>
+          <w:p>
+            <w:r>
+              <w:t>Governing claim</w:t>
+            </w:r>
+          </w:p>
+        </w:tc>
+        <w:tc>
+          <w:tcPr>
+            <w:tcW w:type="dxa" w:w="6912"/>
+          </w:tcPr>
+          <w:p>
+            <w:r>
+              <w:t>Youth unemployment worsened or failed to improve in 8 of 11 subregions between 2023 and 2025.</w:t>
+            </w:r>
+          </w:p>
+        </w:tc>
+      </w:tr>
+      <w:tr>
+        <w:tc>
+          <w:tcPr>
+            <w:tcW w:type="dxa" w:w="2448"/>
+          </w:tcPr>
+          <w:p>
+            <w:r>
+              <w:t>Professional implication</w:t>
+            </w:r>
+          </w:p>
+        </w:tc>
+        <w:tc>
+          <w:tcPr>
+            <w:tcW w:type="dxa" w:w="6912"/>
+          </w:tcPr>
+          <w:p>
+            <w:r>
+              <w:t>Monitor unemployment together with NEET, informality and job-quality measures before judging whether young people are gaining ground.</w:t>
+            </w:r>
+          </w:p>
+        </w:tc>
+      </w:tr>
+      <w:tr>
+        <w:tc>
+          <w:tcPr>
+            <w:tcW w:type="dxa" w:w="2448"/>
+          </w:tcPr>
+          <w:p>
+            <w:r>
+              <w:t>QA status</w:t>
+            </w:r>
+          </w:p>
+        </w:tc>
+        <w:tc>
+          <w:tcPr>
+            <w:tcW w:type="dxa" w:w="6912"/>
+          </w:tcPr>
+          <w:p>
+            <w:r>
+              <w:t>Publish-ready after the accompanying visual and wording are approved by the project owner.</w:t>
+            </w:r>
+          </w:p>
+        </w:tc>
+      </w:tr>
+    </w:tbl>
     <w:p>
       <w:pPr>
         <w:pStyle w:val="Heading1"/>

</xml_diff>

<commit_message>
Complete verified Stage 3 local release candidate
</commit_message>
<xml_diff>
--- a/docs/linkedin-post.docx
+++ b/docs/linkedin-post.docx
@@ -10,8 +10,10 @@
       <w:r>
         <w:rPr>
           <w:b/>
+          <w:color w:val="000000"/>
+          <w:u w:val="none"/>
         </w:rPr>
-        <w:t>LinkedIn Data Story</w:t>
+        <w:t>Youth unemployment LinkedIn post</w:t>
       </w:r>
     </w:p>
     <w:p>
@@ -109,7 +111,7 @@
                 <w:sz w:val="17"/>
               </w:rPr>
               <w:br/>
-              <w:t>subregions worsened or did not improve</w:t>
+              <w:t>subregions with non-negative reported change</w:t>
             </w:r>
           </w:p>
         </w:tc>
@@ -125,12 +127,12 @@
     </w:p>
     <w:p>
       <w:r>
-        <w:t>Youth unemployment is back near its pre-pandemic global rate. The recovery, however, has stalled across most subregions.</w:t>
+        <w:t>Global youth unemployment barely moved. In 8 of 11 subregions, the reported change showed no improvement.</w:t>
       </w:r>
     </w:p>
     <w:p>
       <w:r>
-        <w:t>The ILO estimates the global youth unemployment rate at 12.4% in 2025, compared with 12.3% in 2023. That small global movement hides a much more uneven regional picture:</w:t>
+        <w:t>The ILO estimates the global youth unemployment rate at 12.4% in 2025, compared with 12.3% in 2023. Approximately 67 million young people were unemployed in 2025. The rate covers ages 15–24 and measures unemployment as a share of the youth labour force, not all young people. The regional changes tell a different story:</w:t>
       </w:r>
     </w:p>
     <w:p>
@@ -146,7 +148,7 @@
         <w:pStyle w:val="ListBullet"/>
       </w:pPr>
       <w:r>
-        <w:t>2 showed no change</w:t>
+        <w:t>2 had a reported rounded zero change</w:t>
       </w:r>
     </w:p>
     <w:p>
@@ -164,17 +166,17 @@
     </w:p>
     <w:p>
       <w:r>
-        <w:t>The practical lesson: a stable global average does not mean a broad-based recovery. Regional direction and the quality of available work matter alongside the headline rate. A low unemployment rate can still coexist with inactivity, informality or insecure work.</w:t>
+        <w:t>The two printed zeros do not establish exact stability or statistical significance. These are the ILO-reported changes in percentage points, not differences recalculated from rounded annual rates.</w:t>
       </w:r>
     </w:p>
     <w:p>
       <w:r>
-        <w:t>I rebuilt the analysis as a reviewable Excel evidence layer and a Power BI report with desktop and phone layouts. The source is the ILO’s Global Employment Trends for Youth 2026.</w:t>
+        <w:t>Before treating the global rate as evidence of a broad recovery, check regional direction and complementary measures such as NEET (young people not in employment, education or training), informality and job quality. A low unemployment rate can coexist with inactivity or insecure work. This analysis describes reported changes; it does not identify their causes.</w:t>
       </w:r>
     </w:p>
     <w:p>
       <w:r>
-        <w:t>Which labour-market measure would you pair with unemployment to judge whether young people are genuinely gaining ground?</w:t>
+        <w:t>Which complementary measure would most improve your assessment of youth labour-market conditions?</w:t>
       </w:r>
     </w:p>
     <w:p>
@@ -187,7 +189,7 @@
         <w:pStyle w:val="Heading1"/>
       </w:pPr>
       <w:r>
-        <w:t>Alternative opening hooks</w:t>
+        <w:t>Opening hook options</w:t>
       </w:r>
     </w:p>
     <w:p>
@@ -195,7 +197,7 @@
         <w:pStyle w:val="ListNumber"/>
       </w:pPr>
       <w:r>
-        <w:t>The global youth unemployment rate barely moved. The regional map did.</w:t>
+        <w:t>Global youth unemployment barely moved. In 8 of 11 subregions, the reported change showed no improvement.</w:t>
       </w:r>
     </w:p>
     <w:p>
@@ -203,7 +205,7 @@
         <w:pStyle w:val="ListNumber"/>
       </w:pPr>
       <w:r>
-        <w:t>A stable average can conceal a stalled recovery: 8 of 11 subregions worsened or failed to improve between 2023 and 2025.</w:t>
+        <w:t>Six subregions worsened, two had rounded zero changes and three improved. The global average alone misses that regional contrast.</w:t>
       </w:r>
     </w:p>
     <w:p>
@@ -211,157 +213,16 @@
         <w:pStyle w:val="ListNumber"/>
       </w:pPr>
       <w:r>
-        <w:t>About 67 million young people were unemployed in 2025—and the direction of travel differed sharply by region.</w:t>
+        <w:t>Approximately 67 million young people were unemployed in 2025. To judge recovery, we also need to examine regional direction.</w:t>
       </w:r>
     </w:p>
     <w:p>
       <w:pPr>
         <w:pStyle w:val="Heading1"/>
+        <w:pageBreakBefore/>
       </w:pPr>
       <w:r>
-        <w:t>Story Lock</w:t>
-      </w:r>
-    </w:p>
-    <w:tbl>
-      <w:tblPr>
-        <w:tblStyle w:val="TableGrid"/>
-        <w:tblW w:type="auto" w:w="0"/>
-        <w:tblLook w:firstColumn="1" w:firstRow="1" w:lastColumn="0" w:lastRow="0" w:noHBand="0" w:noVBand="1" w:val="04A0"/>
-      </w:tblPr>
-      <w:tblGrid>
-        <w:gridCol w:w="2448"/>
-        <w:gridCol w:w="6912"/>
-      </w:tblGrid>
-      <w:tr>
-        <w:trPr>
-          <w:tblHeader w:val="true"/>
-        </w:trPr>
-        <w:tc>
-          <w:tcPr>
-            <w:tcW w:type="dxa" w:w="4968"/>
-            <w:shd w:fill="173F5F"/>
-          </w:tcPr>
-          <w:p>
-            <w:r>
-              <w:rPr>
-                <w:b/>
-                <w:color w:val="FFFFFF"/>
-              </w:rPr>
-              <w:t>Element</w:t>
-            </w:r>
-          </w:p>
-        </w:tc>
-        <w:tc>
-          <w:tcPr>
-            <w:tcW w:type="dxa" w:w="4968"/>
-            <w:shd w:fill="173F5F"/>
-          </w:tcPr>
-          <w:p>
-            <w:r>
-              <w:rPr>
-                <w:b/>
-                <w:color w:val="FFFFFF"/>
-              </w:rPr>
-              <w:t>Locked statement</w:t>
-            </w:r>
-          </w:p>
-        </w:tc>
-      </w:tr>
-      <w:tr>
-        <w:tc>
-          <w:tcPr>
-            <w:tcW w:type="dxa" w:w="2448"/>
-          </w:tcPr>
-          <w:p>
-            <w:r>
-              <w:t>Governing question</w:t>
-            </w:r>
-          </w:p>
-        </w:tc>
-        <w:tc>
-          <w:tcPr>
-            <w:tcW w:type="dxa" w:w="6912"/>
-          </w:tcPr>
-          <w:p>
-            <w:r>
-              <w:t>What changed in the youth labour-market recovery after 2023?</w:t>
-            </w:r>
-          </w:p>
-        </w:tc>
-      </w:tr>
-      <w:tr>
-        <w:tc>
-          <w:tcPr>
-            <w:tcW w:type="dxa" w:w="2448"/>
-          </w:tcPr>
-          <w:p>
-            <w:r>
-              <w:t>Governing claim</w:t>
-            </w:r>
-          </w:p>
-        </w:tc>
-        <w:tc>
-          <w:tcPr>
-            <w:tcW w:type="dxa" w:w="6912"/>
-          </w:tcPr>
-          <w:p>
-            <w:r>
-              <w:t>Youth unemployment worsened or failed to improve in 8 of 11 subregions between 2023 and 2025.</w:t>
-            </w:r>
-          </w:p>
-        </w:tc>
-      </w:tr>
-      <w:tr>
-        <w:tc>
-          <w:tcPr>
-            <w:tcW w:type="dxa" w:w="2448"/>
-          </w:tcPr>
-          <w:p>
-            <w:r>
-              <w:t>Professional implication</w:t>
-            </w:r>
-          </w:p>
-        </w:tc>
-        <w:tc>
-          <w:tcPr>
-            <w:tcW w:type="dxa" w:w="6912"/>
-          </w:tcPr>
-          <w:p>
-            <w:r>
-              <w:t>Monitor unemployment together with NEET, informality and job-quality measures before judging whether young people are gaining ground.</w:t>
-            </w:r>
-          </w:p>
-        </w:tc>
-      </w:tr>
-      <w:tr>
-        <w:tc>
-          <w:tcPr>
-            <w:tcW w:type="dxa" w:w="2448"/>
-          </w:tcPr>
-          <w:p>
-            <w:r>
-              <w:t>QA status</w:t>
-            </w:r>
-          </w:p>
-        </w:tc>
-        <w:tc>
-          <w:tcPr>
-            <w:tcW w:type="dxa" w:w="6912"/>
-          </w:tcPr>
-          <w:p>
-            <w:r>
-              <w:t>Publish-ready after the accompanying visual and wording are approved by the project owner.</w:t>
-            </w:r>
-          </w:p>
-        </w:tc>
-      </w:tr>
-    </w:tbl>
-    <w:p>
-      <w:pPr>
-        <w:pStyle w:val="Heading1"/>
-      </w:pPr>
-      <w:r>
-        <w:t>Evidence and wording guardrails</w:t>
+        <w:t>Evidence notes</w:t>
       </w:r>
     </w:p>
     <w:tbl>
@@ -404,7 +265,7 @@
                 <w:b/>
                 <w:color w:val="FFFFFF"/>
               </w:rPr>
-              <w:t>Approved wording</w:t>
+              <w:t>Wording constraint</w:t>
             </w:r>
           </w:p>
         </w:tc>
@@ -470,7 +331,7 @@
           </w:tcPr>
           <w:p>
             <w:r>
-              <w:t>Youth unemployment worsened or failed to improve in 8 of 11 subregions between 2023 and 2025.</w:t>
+              <w:t>Six positive and two rounded-zero changes give 8 of 11 subregions. World is excluded. A printed zero is not proof of exact stability.</w:t>
             </w:r>
           </w:p>
         </w:tc>
@@ -540,6 +401,27 @@
       </w:r>
       <w:r>
         <w:t xml:space="preserve"> — Table A.1 and Figure 1.3 (corrected accessible PDF dated 31 August 2026).</w:t>
+      </w:r>
+    </w:p>
+    <w:p>
+      <w:pPr>
+        <w:pStyle w:val="Heading2"/>
+      </w:pPr>
+      <w:r>
+        <w:t>Attribution and adaptation</w:t>
+      </w:r>
+    </w:p>
+    <w:p>
+      <w:r>
+        <w:t>ILO, Global employment trends for youth 2026: Back to the future, Geneva: International Labour Office, 2026. © ILO. Corrected accessible edition dated 31 August 2026. CC BY 4.0. Selected data were transcribed and presented in independent tables, charts and analytical prose.</w:t>
+      </w:r>
+      <w:r>
+        <w:t xml:space="preserve"> Licence: https://creativecommons.org/licenses/by/4.0/.</w:t>
+      </w:r>
+    </w:p>
+    <w:p>
+      <w:r>
+        <w:t>This is an adaptation of a copyrighted work of the International Labour Organization (ILO). This adaptation has not been prepared, reviewed or endorsed by the ILO and should not be considered an official ILO adaptation. The ILO disclaims all responsibility for its content and accuracy. Responsibility rests solely with the author(s) of the adaptation.</w:t>
       </w:r>
     </w:p>
     <w:sectPr>
@@ -1284,9 +1166,6 @@
     <w:qFormat/>
     <w:rsid w:val="00FC693F"/>
     <w:pPr>
-      <w:pBdr>
-        <w:bottom w:val="single" w:sz="8" w:space="4" w:color="4F81BD" w:themeColor="accent1"/>
-      </w:pBdr>
       <w:spacing w:after="300" w:line="240" w:lineRule="auto"/>
       <w:contextualSpacing/>
     </w:pPr>

</xml_diff>